<commit_message>
fix(templates): reconcile authored elections with canonical reviewed sources
</commit_message>
<xml_diff>
--- a/templates/openagreements-cc-by-4.0/openagreements-confidentiality-invention-assignment-agreement-nevada/template.fill.docx
+++ b/templates/openagreements-cc-by-4.0/openagreements-confidentiality-invention-assignment-agreement-nevada/template.fill.docx
@@ -878,6 +878,11 @@
       </w:r>
     </w:p>
     <w:p>
+      <w:r>
+        <w:t xml:space="preserve">{IF personnel_nonsolicit_included}</w:t>
+      </w:r>
+    </w:p>
+    <w:p>
       <w:pPr>
         <w:pStyle w:val="OABody"/>
         <w:keepNext/>
@@ -907,6 +912,11 @@
       </w:r>
     </w:p>
     <w:p>
+      <w:r>
+        <w:t xml:space="preserve">{END-IF}</w:t>
+      </w:r>
+    </w:p>
+    <w:p>
       <w:pPr>
         <w:pStyle w:val="OABody"/>
         <w:keepNext/>
@@ -1023,6 +1033,11 @@
       </w:r>
     </w:p>
     <w:p>
+      <w:r>
+        <w:t xml:space="preserve">{IF future_employer_notice_included}</w:t>
+      </w:r>
+    </w:p>
+    <w:p>
       <w:pPr>
         <w:pStyle w:val="OABody"/>
         <w:keepNext/>
@@ -1049,6 +1064,11 @@
       </w:pPr>
       <w:r>
         <w:t xml:space="preserve">Company may inform any future employer or other party with whom Employee enters a business relationship of Employee's obligations under this agreement, and Employee will inform such a party of these obligations when relevant. Any such notice will be limited to what is reasonably necessary.</w:t>
+      </w:r>
+    </w:p>
+    <w:p>
+      <w:r>
+        <w:t xml:space="preserve">{END-IF}</w:t>
       </w:r>
     </w:p>
     <w:p>

</xml_diff>

<commit_message>
Separate runtime support from canonical authored projection
</commit_message>
<xml_diff>
--- a/templates/openagreements-cc-by-4.0/openagreements-confidentiality-invention-assignment-agreement-nevada/template.fill.docx
+++ b/templates/openagreements-cc-by-4.0/openagreements-confidentiality-invention-assignment-agreement-nevada/template.fill.docx
@@ -878,11 +878,6 @@
       </w:r>
     </w:p>
     <w:p>
-      <w:r>
-        <w:t xml:space="preserve">{IF personnel_nonsolicit_included}</w:t>
-      </w:r>
-    </w:p>
-    <w:p>
       <w:pPr>
         <w:pStyle w:val="OABody"/>
         <w:keepNext/>
@@ -912,11 +907,6 @@
       </w:r>
     </w:p>
     <w:p>
-      <w:r>
-        <w:t xml:space="preserve">{END-IF}</w:t>
-      </w:r>
-    </w:p>
-    <w:p>
       <w:pPr>
         <w:pStyle w:val="OABody"/>
         <w:keepNext/>
@@ -1033,11 +1023,6 @@
       </w:r>
     </w:p>
     <w:p>
-      <w:r>
-        <w:t xml:space="preserve">{IF future_employer_notice_included}</w:t>
-      </w:r>
-    </w:p>
-    <w:p>
       <w:pPr>
         <w:pStyle w:val="OABody"/>
         <w:keepNext/>
@@ -1064,11 +1049,6 @@
       </w:pPr>
       <w:r>
         <w:t xml:space="preserve">Company may inform any future employer or other party with whom Employee enters a business relationship of Employee's obligations under this agreement, and Employee will inform such a party of these obligations when relevant. Any such notice will be limited to what is reasonably necessary.</w:t>
-      </w:r>
-    </w:p>
-    <w:p>
-      <w:r>
-        <w:t xml:space="preserve">{END-IF}</w:t>
       </w:r>
     </w:p>
     <w:p>

</xml_diff>

<commit_message>
fix(templates): project authored canonical updates
Canonical source: UseJunior/legal-explainer@47f6752238c8ee34d84852053cddb29a6f417234. All 36 artifacts are copied byte-for-byte from its projector output. Adds matching CIIAA model gates and fill coverage; no OA-only authored edits.
</commit_message>
<xml_diff>
--- a/templates/openagreements-cc-by-4.0/openagreements-confidentiality-invention-assignment-agreement-nevada/template.fill.docx
+++ b/templates/openagreements-cc-by-4.0/openagreements-confidentiality-invention-assignment-agreement-nevada/template.fill.docx
@@ -878,6 +878,11 @@
       </w:r>
     </w:p>
     <w:p>
+      <w:r>
+        <w:t xml:space="preserve">{IF personnel_nonsolicit_included}</w:t>
+      </w:r>
+    </w:p>
+    <w:p>
       <w:pPr>
         <w:pStyle w:val="OABody"/>
         <w:keepNext/>
@@ -907,6 +912,11 @@
       </w:r>
     </w:p>
     <w:p>
+      <w:r>
+        <w:t xml:space="preserve">{END-IF}</w:t>
+      </w:r>
+    </w:p>
+    <w:p>
       <w:pPr>
         <w:pStyle w:val="OABody"/>
         <w:keepNext/>
@@ -1023,6 +1033,11 @@
       </w:r>
     </w:p>
     <w:p>
+      <w:r>
+        <w:t xml:space="preserve">{IF future_employer_notice_included}</w:t>
+      </w:r>
+    </w:p>
+    <w:p>
       <w:pPr>
         <w:pStyle w:val="OABody"/>
         <w:keepNext/>
@@ -1049,6 +1064,11 @@
       </w:pPr>
       <w:r>
         <w:t xml:space="preserve">Company may inform any future employer or other party with whom Employee enters a business relationship of Employee's obligations under this agreement, and Employee will inform such a party of these obligations when relevant. Any such notice will be limited to what is reasonably necessary.</w:t>
+      </w:r>
+    </w:p>
+    <w:p>
+      <w:r>
+        <w:t xml:space="preserve">{END-IF}</w:t>
       </w:r>
     </w:p>
     <w:p>

</xml_diff>

<commit_message>
fix(templates): project authored canonical updates (#843)
Canonical source: UseJunior/legal-explainer@47f6752238c8ee34d84852053cddb29a6f417234. All 36 artifacts are copied byte-for-byte from its projector output. Adds matching CIIAA model gates and fill coverage; no OA-only authored edits.
</commit_message>
<xml_diff>
--- a/templates/openagreements-cc-by-4.0/openagreements-confidentiality-invention-assignment-agreement-nevada/template.fill.docx
+++ b/templates/openagreements-cc-by-4.0/openagreements-confidentiality-invention-assignment-agreement-nevada/template.fill.docx
@@ -878,6 +878,11 @@
       </w:r>
     </w:p>
     <w:p>
+      <w:r>
+        <w:t xml:space="preserve">{IF personnel_nonsolicit_included}</w:t>
+      </w:r>
+    </w:p>
+    <w:p>
       <w:pPr>
         <w:pStyle w:val="OABody"/>
         <w:keepNext/>
@@ -907,6 +912,11 @@
       </w:r>
     </w:p>
     <w:p>
+      <w:r>
+        <w:t xml:space="preserve">{END-IF}</w:t>
+      </w:r>
+    </w:p>
+    <w:p>
       <w:pPr>
         <w:pStyle w:val="OABody"/>
         <w:keepNext/>
@@ -1023,6 +1033,11 @@
       </w:r>
     </w:p>
     <w:p>
+      <w:r>
+        <w:t xml:space="preserve">{IF future_employer_notice_included}</w:t>
+      </w:r>
+    </w:p>
+    <w:p>
       <w:pPr>
         <w:pStyle w:val="OABody"/>
         <w:keepNext/>
@@ -1049,6 +1064,11 @@
       </w:pPr>
       <w:r>
         <w:t xml:space="preserve">Company may inform any future employer or other party with whom Employee enters a business relationship of Employee's obligations under this agreement, and Employee will inform such a party of these obligations when relevant. Any such notice will be limited to what is reasonably necessary.</w:t>
+      </w:r>
+    </w:p>
+    <w:p>
+      <w:r>
+        <w:t xml:space="preserve">{END-IF}</w:t>
       </w:r>
     </w:p>
     <w:p>

</xml_diff>